<commit_message>
feat: support KL heading levels four to six
</commit_message>
<xml_diff>
--- a/Demo/template.docx
+++ b/Demo/template.docx
@@ -1068,6 +1068,7 @@
     </w:lvl>
     <w:lvl w:ilvl="3" w:tentative="0">
       <w:start w:val="1"/>
+      <w:pStyle w:val="27"/>
       <w:numFmt w:val="decimal"/>
       <w:lvlText w:val="%1.%2.%3.%4"/>
       <w:lvlJc w:val="left"/>
@@ -1080,6 +1081,7 @@
     </w:lvl>
     <w:lvl w:ilvl="4" w:tentative="0">
       <w:start w:val="1"/>
+      <w:pStyle w:val="34"/>
       <w:numFmt w:val="decimal"/>
       <w:lvlText w:val="%1.%2.%3.%4.%5"/>
       <w:lvlJc w:val="left"/>
@@ -1092,6 +1094,7 @@
     </w:lvl>
     <w:lvl w:ilvl="5" w:tentative="0">
       <w:start w:val="1"/>
+      <w:pStyle w:val="35"/>
       <w:numFmt w:val="decimal"/>
       <w:lvlText w:val="%1.%2.%3.%4.%5.%6"/>
       <w:lvlJc w:val="left"/>
@@ -1936,6 +1939,7 @@
         <w:ilvl w:val="0"/>
         <w:numId w:val="3"/>
       </w:numPr>
+      <w:outlineLvl w:val="0"/>
     </w:pPr>
     <w:rPr>
       <w:rFonts w:hint="default" w:ascii="宋体" w:hAnsi="宋体" w:eastAsia="宋体" w:cs="Times New Roman"/>
@@ -1961,6 +1965,7 @@
       </w:tabs>
       <w:spacing w:line="360" w:lineRule="auto"/>
       <w:ind w:left="567" w:hanging="567"/>
+      <w:outlineLvl w:val="1"/>
     </w:pPr>
   </w:style>
   <w:style w:type="paragraph" w:customStyle="1" w:styleId="19">
@@ -1978,6 +1983,7 @@
         <w:tab w:val="clear" w:pos="420"/>
       </w:tabs>
       <w:ind w:left="0" w:firstLine="0"/>
+      <w:outlineLvl w:val="2"/>
     </w:pPr>
     <w:rPr>
       <w:rFonts w:eastAsia="宋体" w:cs="Times New Roman"/>
@@ -1986,6 +1992,78 @@
       <w:color w:val="auto"/>
     </w:rPr>
   </w:style>
+  <w:style w:type="paragraph" w:customStyle="1" w:styleId="27">
+    <w:name w:val="KL四级标题"/>
+    <w:basedOn w:val="26"/>
+    <w:next w:val="28"/>
+    <w:qFormat/>
+    <w:uiPriority w:val="0"/>
+    <w:pPr>
+      <w:numPr>
+        <w:ilvl w:val="3"/>
+        <w:numId w:val="3"/>
+      </w:numPr>
+      <w:ind w:left="0" w:firstLine="0"/>
+      <w:outlineLvl w:val="3"/>
+      <w:spacing w:line="360" w:lineRule="auto"/>
+    </w:pPr>
+    <w:rPr>
+      <w:rFonts w:eastAsia="宋体" w:cs="宋体" w:ascii="宋体" w:hAnsi="宋体"/>
+      <w:color w:val="auto"/>
+      <w:b w:val="0"/>
+      <w:bCs w:val="0"/>
+      <w:sz w:val="24"/>
+      <w:szCs w:val="24"/>
+    </w:rPr>
+  </w:style>
+  <w:style w:type="paragraph" w:customStyle="1" w:styleId="34">
+    <w:name w:val="KL五级标题"/>
+    <w:basedOn w:val="27"/>
+    <w:next w:val="28"/>
+    <w:qFormat/>
+    <w:uiPriority w:val="0"/>
+    <w:pPr>
+      <w:numPr>
+        <w:ilvl w:val="4"/>
+        <w:numId w:val="3"/>
+      </w:numPr>
+      <w:ind w:left="0" w:firstLine="0"/>
+      <w:outlineLvl w:val="4"/>
+      <w:spacing w:line="360" w:lineRule="auto"/>
+    </w:pPr>
+    <w:rPr>
+      <w:rFonts w:eastAsia="宋体" w:cs="宋体" w:ascii="宋体" w:hAnsi="宋体"/>
+      <w:color w:val="auto"/>
+      <w:b w:val="0"/>
+      <w:bCs w:val="0"/>
+      <w:sz w:val="24"/>
+      <w:szCs w:val="24"/>
+    </w:rPr>
+  </w:style>
+  <w:style w:type="paragraph" w:customStyle="1" w:styleId="35">
+    <w:name w:val="KL六级标题"/>
+    <w:basedOn w:val="34"/>
+    <w:next w:val="28"/>
+    <w:qFormat/>
+    <w:uiPriority w:val="0"/>
+    <w:pPr>
+      <w:numPr>
+        <w:ilvl w:val="5"/>
+        <w:numId w:val="3"/>
+      </w:numPr>
+      <w:ind w:left="0" w:firstLine="0"/>
+      <w:outlineLvl w:val="5"/>
+      <w:spacing w:line="360" w:lineRule="auto"/>
+    </w:pPr>
+    <w:rPr>
+      <w:rFonts w:eastAsia="宋体" w:cs="宋体" w:ascii="宋体" w:hAnsi="宋体"/>
+      <w:color w:val="auto"/>
+      <w:b w:val="0"/>
+      <w:bCs w:val="0"/>
+      <w:sz w:val="24"/>
+      <w:szCs w:val="24"/>
+    </w:rPr>
+  </w:style>
   <w:style w:type="paragraph" w:customStyle="1" w:styleId="20">
     <w:name w:val="KL正文"/>
     <w:qFormat/>
@@ -2042,19 +2120,6 @@
       <w:szCs w:val="24"/>
     </w:rPr>
   </w:style>
-  <w:style w:type="paragraph" w:customStyle="1" w:styleId="24">
-    <w:name w:val="KL其他标题"/>
-    <w:qFormat/>
-    <w:uiPriority w:val="0"/>
-    <w:pPr>
-      <w:spacing w:line="360" w:lineRule="auto"/>
-    </w:pPr>
-    <w:rPr>
-      <w:rFonts w:hint="eastAsia" w:ascii="宋体" w:hAnsi="宋体" w:eastAsia="宋体" w:cstheme="minorBidi"/>
-      <w:sz w:val="24"/>
-      <w:szCs w:val="24"/>
-    </w:rPr>
-  </w:style>
   <w:style w:type="paragraph" w:customStyle="1" w:styleId="25">
     <w:name w:val="KL页脚"/>
     <w:qFormat/>
@@ -2081,15 +2146,6 @@
       <w:rFonts w:hint="eastAsia" w:ascii="宋体" w:hAnsi="宋体" w:eastAsia="宋体" w:cstheme="minorBidi"/>
       <w:sz w:val="24"/>
       <w:szCs w:val="24"/>
-    </w:rPr>
-  </w:style>
-  <w:style w:type="paragraph" w:customStyle="1" w:styleId="27">
-    <w:name w:val="Normal0"/>
-    <w:qFormat/>
-    <w:uiPriority w:val="0"/>
-    <w:rPr>
-      <w:rFonts w:ascii="Times New Roman" w:hAnsi="Times New Roman" w:eastAsia="宋体" w:cs="Times New Roman"/>
-      <w:lang w:val="en-US" w:eastAsia="en-US" w:bidi="ar-SA"/>
     </w:rPr>
   </w:style>
 </w:styles>

</xml_diff>